<commit_message>
Add repository link to report and slides; reword AI-use statement
Report: code link in 'Data and code availability' (AI logs stay in the private supplement). Slides: repo link on the title and closing slides. Q&A sheet and READMEs point to the repo.
</commit_message>
<xml_diff>
--- a/step5_report/BT3041_final_report.docx
+++ b/step5_report/BT3041_final_report.docx
@@ -3025,7 +3025,7 @@
           <w:rFonts w:ascii="Arial" w:hAnsi="Arial"/>
           <w:sz w:val="22"/>
         </w:rPr>
-        <w:t xml:space="preserve"> TCGA data from UCSC Xena (GDC and TCGA hubs); METABRIC data from the cBioPortal datahub, used under the Open Database License (ODbL). Code, parameters, logs, AI prompts and AI chat histories are in the supplementary material: [GitHub or Drive link]. </w:t>
+        <w:t xml:space="preserve"> TCGA data from UCSC Xena (GDC and TCGA hubs); METABRIC data from the cBioPortal datahub, used under the Open Database License (ODbL). Code, parameters, results and logs: https://github.com/Vijayavallabh/BT3041_Project. AI prompts and AI chat histories are in the supplementary material: [Drive link]. </w:t>
       </w:r>
       <w:r>
         <w:rPr>
@@ -3040,7 +3040,7 @@
           <w:rFonts w:ascii="Arial" w:hAnsi="Arial"/>
           <w:sz w:val="22"/>
         </w:rPr>
-        <w:t xml:space="preserve"> an AI assistant helped plan the analysis, write and run the code, review the results and draft this report; the team checked every number against the result files and every reference against PubMed. Prompts and chat histories are in the supplement.</w:t>
+        <w:t xml:space="preserve"> an AI assistant helped plan the analysis, write and run the code, review the results and draft this report; every number was checked against the result files and every reference against PubMed.</w:t>
       </w:r>
     </w:p>
     <w:p>

</xml_diff>

<commit_message>
Record the 23 Oct label sign-off
HER2 rule v1, the 9 exclusions and groups 591/160/157 are kept after review against ASCO/CAP 2018. The report methods now state the ASCO/CAP basis and that the 5 IHC 3+/FISH-negative tumours were left unlabelled; pending sign-off wording removed from READMEs, the Q&A sheet and code comments. No data or results change.
</commit_message>
<xml_diff>
--- a/step5_report/BT3041_final_report.docx
+++ b/step5_report/BT3041_final_report.docx
@@ -219,7 +219,7 @@
           <w:rFonts w:ascii="Arial" w:hAnsi="Arial"/>
           <w:sz w:val="22"/>
         </w:rPr>
-        <w:t xml:space="preserve"> We kept one primary tumour per patient (1,097) and excluded 9: five whose HiSeqV2 and STAR profiles did not match each other (Spearman ρ below the 99th percentile of between-patient correlations) and five whose clinical record is redacted in the Clinical Data Resource (one tumour failed both), leaving 1,088 tumours for all label-free work. HER2 was called from FISH first, then the IHC score (3+ positive, 0/1+ negative, 2+ without FISH missing), using the status text only when no score was recorded; conflicting records were set to missing. This rule agrees with the TCGA 2012 HER2 calls at κ = 0.88. The supervised set holds the 1,076 female patients (12 male patients were kept only for label-free work). Groups were HR+/HER2− (ER or PR positive, HER2 negative), HER2+ (any ER/PR) and TNBC (all three negative); 168 tumours lacked one of the three results. For differential expression we kept STAR genes with ≥ 10 counts in at least 157 tumours (the smallest group), 24,660 genes. Matrices were left unscaled so that every scaling step could run inside cross-validation folds. Table 1 lists the data sets.</w:t>
+        <w:t xml:space="preserve"> We kept one primary tumour per patient (1,097) and excluded 9: five whose HiSeqV2 and STAR profiles did not match each other (Spearman ρ below the 99th percentile of between-patient correlations) and five whose clinical record is redacted in the Clinical Data Resource (one tumour failed both), leaving 1,088 tumours for all label-free work. HER2 followed ASCO/CAP 2018 [2]: FISH first, then the IHC score (3+ positive, 0/1+ negative, 2+ without FISH missing), using the status text only when no score was recorded. IHC 3+ with a negative FISH (5 tumours) was treated as discordant and left unlabelled, as were other conflicting records. This rule agrees with the TCGA 2012 HER2 calls at κ = 0.88. The supervised set holds the 1,076 female patients (12 male patients were kept only for label-free work). Groups were HR+/HER2− (ER or PR positive, HER2 negative), HER2+ (any ER/PR) and TNBC (all three negative); 168 tumours lacked one of the three results. For differential expression we kept STAR genes with ≥ 10 counts in at least 157 tumours (the smallest group), 24,660 genes. Matrices were left unscaled so that every scaling step could run inside cross-validation folds. Table 1 lists the data sets.</w:t>
       </w:r>
     </w:p>
     <w:p>
@@ -241,7 +241,7 @@
           <w:rFonts w:ascii="Arial" w:hAnsi="Arial"/>
           <w:sz w:val="22"/>
         </w:rPr>
-        <w:t xml:space="preserve"> Data sets and group sizes under the current labels (HER2 rule v1). *METABRIC groups use IHC ER and SNP6 copy-number HER2 (gain vs no gain); PR is not available, so the ER−/HER2-not-gained group is not called TNBC.</w:t>
+        <w:t xml:space="preserve"> Data sets and group sizes under the final labels (HER2 rule v1). *METABRIC groups use IHC ER and SNP6 copy-number HER2 (gain vs no gain); PR is not available, so the ER−/HER2-not-gained group is not called TNBC.</w:t>
       </w:r>
     </w:p>
     <w:tbl>

</xml_diff>

<commit_message>
Add Team 16 names to the report and slides
Names replace the placeholders on the title slide, in the speaker notes and Q&A owners (presenters follow the plan's M1-M5 workstreams), and in the report title block; roll numbers remain placeholders. The report states that the AI logs are shared privately with the course instructors.
</commit_message>
<xml_diff>
--- a/step5_report/BT3041_final_report.docx
+++ b/step5_report/BT3041_final_report.docx
@@ -39,7 +39,9 @@
           <w:rFonts w:ascii="Arial" w:hAnsi="Arial"/>
           <w:sz w:val="22"/>
         </w:rPr>
-        <w:t>Team: [Name 1, roll no.] · [Name 2, roll no.] · [Name 3, roll no.] · [Name 4, roll no.] · [Name 5, roll no.]</w:t>
+        <w:t>Team 16: Vijayavallabh [roll no.] · Vedant [roll no.] · Harshit [roll no.]</w:t>
+        <w:br/>
+        <w:t>Navya [roll no.] · Anitha [roll no.]</w:t>
       </w:r>
     </w:p>
     <w:p>
@@ -3010,7 +3012,7 @@
     <w:p>
       <w:pPr>
         <w:spacing w:after="80"/>
-        <w:jc w:val="both"/>
+        <w:jc w:val="left"/>
       </w:pPr>
       <w:r>
         <w:rPr>
@@ -3025,7 +3027,7 @@
           <w:rFonts w:ascii="Arial" w:hAnsi="Arial"/>
           <w:sz w:val="22"/>
         </w:rPr>
-        <w:t xml:space="preserve"> TCGA data from UCSC Xena (GDC and TCGA hubs); METABRIC data from the cBioPortal datahub, used under the Open Database License (ODbL). Code, parameters, results and logs: https://github.com/Vijayavallabh/BT3041_Project. AI prompts and AI chat histories are in the supplementary material: [Drive link]. </w:t>
+        <w:t xml:space="preserve"> TCGA data from UCSC Xena (GDC and TCGA hubs); METABRIC data from the cBioPortal datahub, used under the Open Database License (ODbL). Code, parameters, results and logs: https://github.com/Vijayavallabh/BT3041_Project. AI prompts and AI chat histories are shared privately with the course instructors as supplementary material. </w:t>
       </w:r>
       <w:r>
         <w:rPr>

</xml_diff>

<commit_message>
Balance the report title lines; keep roll numbers out of the public copy
The report and slide builds read roll numbers from a private roll_numbers.json
(gitignored) and list names only when it is absent.
</commit_message>
<xml_diff>
--- a/step5_report/BT3041_final_report.docx
+++ b/step5_report/BT3041_final_report.docx
@@ -13,7 +13,11 @@
           <w:b/>
           <w:sz w:val="26"/>
         </w:rPr>
-        <w:t>What tumour gene expression reveals about the clinical receptor groups of breast cancer: a TCGA analysis checked in protein and an independent cohort</w:t>
+        <w:t>What tumour gene expression reveals about the clinical</w:t>
+        <w:br/>
+        <w:t>receptor groups of breast cancer: a TCGA analysis</w:t>
+        <w:br/>
+        <w:t>checked in protein and an independent cohort</w:t>
       </w:r>
     </w:p>
     <w:p>
@@ -26,7 +30,9 @@
           <w:rFonts w:ascii="Arial" w:hAnsi="Arial"/>
           <w:sz w:val="22"/>
         </w:rPr>
-        <w:t>BT3041 Analysis and Interpretation of Biological Data · Term project report · IIT Madras · November 2026</w:t>
+        <w:t>BT3041 Analysis and Interpretation of Biological Data · Term project report</w:t>
+        <w:br/>
+        <w:t>IIT Madras · November 2026</w:t>
       </w:r>
     </w:p>
     <w:p>
@@ -39,9 +45,7 @@
           <w:rFonts w:ascii="Arial" w:hAnsi="Arial"/>
           <w:sz w:val="22"/>
         </w:rPr>
-        <w:t>Team 16: Vijayavallabh [roll no.] · Vedant [roll no.] · Harshit [roll no.]</w:t>
-        <w:br/>
-        <w:t>Navya [roll no.] · Anitha [roll no.]</w:t>
+        <w:t>Team 16: Vijayavallabh · Vedant · Harshit · Navya · Anitha</w:t>
       </w:r>
     </w:p>
     <w:p>

</xml_diff>

<commit_message>
Revise report, slide and README prose for clarity
Split long sentences, remove stock phrasing and match claims to their evidence.
No number, result, figure or citation changed; report still 8 pages, talk still 7:45.
</commit_message>
<xml_diff>
--- a/step5_report/BT3041_final_report.docx
+++ b/step5_report/BT3041_final_report.docx
@@ -66,7 +66,7 @@
           <w:rFonts w:ascii="Arial" w:hAnsi="Arial"/>
           <w:sz w:val="22"/>
         </w:rPr>
-        <w:t xml:space="preserve"> Breast cancers are grouped for treatment by three clinical tests: oestrogen receptor (ER), progesterone receptor (PR) and HER2. We asked what tumour RNA-seq reveals about these clinical groups, using the clinical labels (not the expression-derived PAM50 subtypes) to avoid circular reasoning. In 1,088 TCGA tumours (clinical groups: HR+/HER2− 591, HER2+ 160, triple-negative 157), label-free clustering recovered a basal-like group that held 138 of 157 triple-negative tumours (ARI with ER status 0.67). Against HR+/HER2− tumours, triple-negative tumours differed more than 2-fold in 2,741 genes (FDR 5%), with the oestrogen-response programme down and proliferation, MYC and immune programmes up; only the oestrogen-response shift survived a correlation-aware gene-set test. Classifiers trained on the whole transcriptome matched, but did not beat, the receptor gene alone (ER: </w:t>
+        <w:t xml:space="preserve"> Breast cancers are assigned to treatment groups by three clinical tests: oestrogen receptor (ER), progesterone receptor (PR) and HER2. We asked what tumour RNA-seq tells us about these clinical groups. We used the clinical labels as ground truth rather than the PAM50 subtypes, because PAM50 is itself derived from expression. In 1,088 TCGA tumours (HR+/HER2− 591, HER2+ 160, triple-negative 157), clustering without labels found a basal-like group that contained 138 of the 157 triple-negative tumours (ARI with ER status 0.67). Compared with HR+/HER2− tumours, triple-negative tumours differed more than 2-fold in 2,741 genes (FDR 5%). The oestrogen-response programme was lower and the proliferation, MYC and immune programmes were higher, but only the oestrogen-response shift remained significant in a correlation-aware gene-set test. Classifiers trained on the whole transcriptome performed as well as the receptor gene alone, not better (ER: </w:t>
       </w:r>
       <w:r>
         <w:rPr>
@@ -96,7 +96,7 @@
           <w:rFonts w:ascii="Arial" w:hAnsi="Arial"/>
           <w:sz w:val="22"/>
         </w:rPr>
-        <w:t xml:space="preserve"> 0.845 vs 0.851). The findings held in protein from the same tumours (mRNA–protein effect correlation ρ = 0.80) and in 1,980 METABRIC tumours (frozen-model AUC 0.96 for ER, 0.91 for HER2; 86% of differentially expressed genes replicated).</w:t>
+        <w:t xml:space="preserve"> 0.845 vs 0.851). The results agreed with protein levels in the same tumours (mRNA–protein effect correlation ρ = 0.80) and with 1,980 METABRIC tumours, where the frozen models reached AUC 0.96 for ER and 0.91 for HER2 and 86% of the differentially expressed genes replicated.</w:t>
       </w:r>
     </w:p>
     <w:p>
@@ -117,7 +117,7 @@
           <w:rFonts w:ascii="Arial" w:hAnsi="Arial"/>
           <w:sz w:val="22"/>
         </w:rPr>
-        <w:t>Pathologists test every invasive breast cancer for ER and PR by immunohistochemistry (IHC) and for HER2 by IHC or in-situ hybridisation (FISH) [1, 2]. The result chooses the therapy: endocrine drugs for hormone-receptor-positive (HR+) disease, anti-HER2 antibodies for HER2+ disease and chemotherapy for triple-negative breast cancer (TNBC), which has no targeted option. Expression profiling defined the intrinsic subtypes (luminal A/B, HER2-enriched, basal-like) [3, 4], now assigned with the PAM50 centroids [5]. Many machine-learning studies predict PAM50 from RNA-seq, but PAM50 is itself computed from RNA, so such accuracy partly measures agreement of an algorithm with itself. We therefore used the clinical IHC/FISH labels as the ground truth and PAM50 only as a comparator.</w:t>
+        <w:t>Pathologists test every invasive breast cancer for ER and PR by immunohistochemistry (IHC) and for HER2 by IHC or in-situ hybridisation (FISH) [1, 2]. These results decide the treatment: endocrine drugs for hormone-receptor-positive (HR+) disease, anti-HER2 antibodies for HER2+ disease, and chemotherapy for triple-negative breast cancer (TNBC), for which there is no targeted option. Expression profiling defined the intrinsic subtypes (luminal A/B, HER2-enriched, basal-like) [3, 4], which are now assigned with the PAM50 centroids [5]. Many machine-learning studies predict PAM50 from RNA-seq. Since PAM50 is computed from RNA in the first place, part of their accuracy simply reflects an algorithm agreeing with itself. For this reason we treated the clinical IHC/FISH labels as ground truth and used PAM50 only for comparison.</w:t>
       </w:r>
     </w:p>
     <w:p>
@@ -130,7 +130,7 @@
           <w:rFonts w:ascii="Arial" w:hAnsi="Arial"/>
           <w:sz w:val="22"/>
         </w:rPr>
-        <w:t xml:space="preserve">We asked three questions. </w:t>
+        <w:t xml:space="preserve">We set out to answer three questions. </w:t>
       </w:r>
       <w:r>
         <w:rPr>
@@ -145,7 +145,7 @@
           <w:rFonts w:ascii="Arial" w:hAnsi="Arial"/>
           <w:sz w:val="22"/>
         </w:rPr>
-        <w:t xml:space="preserve"> Does label-free structure in tumour expression (PCA, UMAP, clustering) recover the clinical receptor groups? </w:t>
+        <w:t xml:space="preserve"> Does the structure of tumour expression, found without labels (PCA, UMAP, clustering), recover the clinical receptor groups? </w:t>
       </w:r>
       <w:r>
         <w:rPr>
@@ -160,7 +160,7 @@
           <w:rFonts w:ascii="Arial" w:hAnsi="Arial"/>
           <w:sz w:val="22"/>
         </w:rPr>
-        <w:t xml:space="preserve"> Which genes and pathways differ between TNBC and HR+/HER2− tumours, and how robust are they? </w:t>
+        <w:t xml:space="preserve"> Which genes and pathways differ between TNBC and HR+/HER2− tumours, and how robust are these differences? </w:t>
       </w:r>
       <w:r>
         <w:rPr>
@@ -175,7 +175,7 @@
           <w:rFonts w:ascii="Arial" w:hAnsi="Arial"/>
           <w:sz w:val="22"/>
         </w:rPr>
-        <w:t xml:space="preserve"> Can whole-transcriptome classifiers predict clinical ER and HER2 status better than the receptor gene alone? Every answer was checked in a second assay (protein, RPPA) on the same tumours, in an independent cohort (METABRIC) with labels from other assays, and against published numbers.</w:t>
+        <w:t xml:space="preserve"> Can whole-transcriptome classifiers predict clinical ER and HER2 status better than the receptor gene on its own? We checked each answer in three ways: in a second assay (RPPA protein) on the same tumours, in an independent cohort (METABRIC) whose labels come from other assays, and against published numbers.</w:t>
       </w:r>
     </w:p>
     <w:p>
@@ -204,7 +204,7 @@
           <w:rFonts w:ascii="Arial" w:hAnsi="Arial"/>
           <w:sz w:val="22"/>
         </w:rPr>
-        <w:t xml:space="preserve"> TCGA-BRCA RNA-seq (HiSeqV2, log2(RSEM+1)), STAR gene counts (GDC, GENCODE v36), clinical IHC/FISH fields, reverse-phase protein arrays (RPPA) and PAM50 calls were downloaded from UCSC Xena [6]; survival end points came from the TCGA Clinical Data Resource [7]. METABRIC Illumina HT-12 expression and clinical tables [8, 9] came from the cBioPortal datahub. Gene symbols in every data set (and the Hallmark gene sets [10]) were mapped to current HGNC symbols. Raw files were checksummed at a data freeze.</w:t>
+        <w:t xml:space="preserve"> TCGA-BRCA RNA-seq (HiSeqV2, log2(RSEM+1)), STAR gene counts (GDC, GENCODE v36), clinical IHC/FISH fields, reverse-phase protein arrays (RPPA) and PAM50 calls were downloaded from UCSC Xena [6]; survival end points came from the TCGA Clinical Data Resource [7]. METABRIC Illumina HT-12 expression and clinical tables [8, 9] were taken from the cBioPortal datahub. Gene symbols in all data sets, including the Hallmark gene sets [10], were mapped to current HGNC symbols, and the raw files were checksummed at a data freeze.</w:t>
       </w:r>
     </w:p>
     <w:p>
@@ -225,7 +225,7 @@
           <w:rFonts w:ascii="Arial" w:hAnsi="Arial"/>
           <w:sz w:val="22"/>
         </w:rPr>
-        <w:t xml:space="preserve"> We kept one primary tumour per patient (1,097) and excluded 9: five whose HiSeqV2 and STAR profiles did not match each other (Spearman ρ below the 99th percentile of between-patient correlations) and five whose clinical record is redacted in the Clinical Data Resource (one tumour failed both), leaving 1,088 tumours for all label-free work. HER2 followed ASCO/CAP 2018 [2]: FISH first, then the IHC score (3+ positive, 0/1+ negative, 2+ without FISH missing), using the status text only when no score was recorded. IHC 3+ with a negative FISH (5 tumours) was treated as discordant and left unlabelled, as were other conflicting records. This rule agrees with the TCGA 2012 HER2 calls at κ = 0.88. The supervised set holds the 1,076 female patients (12 male patients were kept only for label-free work). Groups were HR+/HER2− (ER or PR positive, HER2 negative), HER2+ (any ER/PR) and TNBC (all three negative); 168 tumours lacked one of the three results. For differential expression we kept STAR genes with ≥ 10 counts in at least 157 tumours (the smallest group), 24,660 genes. Matrices were left unscaled so that every scaling step could run inside cross-validation folds. Table 1 lists the data sets.</w:t>
+        <w:t xml:space="preserve"> We kept one primary tumour per patient (1,097) and excluded 9. Five of these had HiSeqV2 and STAR profiles that did not match (Spearman ρ below the 99th percentile of between-patient correlations), and five have a redacted clinical record in the Clinical Data Resource; one tumour failed both checks. This left 1,088 tumours for all label-free work. HER2 status followed ASCO/CAP 2018 [2]. FISH was used first, then the IHC score (3+ positive, 0/1+ negative, 2+ without FISH missing), and the status text only when no score was recorded. Tumours that were IHC 3+ but FISH-negative (5) were treated as discordant and left unlabelled, as were other conflicting records. This rule agrees with the TCGA 2012 HER2 calls at κ = 0.88. The supervised set contains the 1,076 female patients; the 12 male patients were used only in label-free work. The groups were HR+/HER2− (ER or PR positive, HER2 negative), HER2+ (any ER/PR) and TNBC (all three negative), and 168 tumours were missing one of the three results. For differential expression we kept the 24,660 STAR genes with ≥ 10 counts in at least 157 tumours (the size of the smallest group). We did not scale the matrices at this stage, so that every scaling step could be done inside the cross-validation folds. Table 1 lists the data sets.</w:t>
       </w:r>
     </w:p>
     <w:p>
@@ -1101,7 +1101,7 @@
           <w:rFonts w:ascii="Arial" w:hAnsi="Arial"/>
           <w:sz w:val="22"/>
         </w:rPr>
-        <w:t>All analyses used Python 3.12 (scikit-learn, PyDESeq2, GSEApy, lifelines) with seed 42; every parameter and package version is written to a params.json next to each result, and the code is in the supplementary material. Multiple tests were corrected by Benjamini–Hochberg (BH) FDR [11].</w:t>
+        <w:t>All analyses were run in Python 3.12 (scikit-learn, PyDESeq2, GSEApy, lifelines) with seed 42. Each result folder has a params.json that records every parameter and package version, and the code is in the supplementary material. P-values from multiple tests were corrected with the Benjamini–Hochberg (BH) FDR [11].</w:t>
       </w:r>
     </w:p>
     <w:p>
@@ -1122,7 +1122,7 @@
           <w:rFonts w:ascii="Arial" w:hAnsi="Arial"/>
           <w:sz w:val="22"/>
         </w:rPr>
-        <w:t xml:space="preserve"> PCA and UMAP [12] (15 neighbours) used the 2,000 most variable genes after removing sex-chromosome-specific genes. We tested marker genes between groups with Mann–Whitney U tests (rank-biserial r as effect size) and the share of PC variance explained by group and by tissue-source site (η², with a permutation chance level). k-means (k = 2–8, PAM50 genes left out) was run with consensus clustering [13] (100 resamples of 80% of tumours); k was chosen before looking at the labels as the lowest proportion of ambiguous clustering (PAC) [14]. Agreement with labels was measured by the adjusted Rand index (ARI) with bootstrap 95% CIs and compared with the best ARI reachable by two clusters.</w:t>
+        <w:t xml:space="preserve"> PCA and UMAP [12] (15 neighbours) were computed on the 2,000 most variable genes after sex-chromosome-specific genes were removed. Marker genes were compared between groups with Mann–Whitney U tests, using rank-biserial r as the effect size. We also measured how much PC variance was explained by group and by tissue-source site (η², against a permutation chance level). k-means (k = 2–8, without the PAM50 genes) was combined with consensus clustering [13] over 100 resamples of 80% of the tumours. We fixed k before looking at the labels, as the value with the lowest proportion of ambiguous clustering (PAC) [14]. Agreement with the labels was measured by the adjusted Rand index (ARI) with bootstrap 95% CIs, and compared with the best ARI that two clusters can reach.</w:t>
       </w:r>
     </w:p>
     <w:p>
@@ -1143,7 +1143,7 @@
           <w:rFonts w:ascii="Arial" w:hAnsi="Arial"/>
           <w:sz w:val="22"/>
         </w:rPr>
-        <w:t xml:space="preserve"> PyDESeq2 [15, 16] on raw STAR counts with design ~ histology + group tested |log2FC| &gt; 1 directly (lfc_null = 1) rather than filtering by fold change after a test of zero change. Fold changes were shrunk for ranking and plotting. Sensitivity runs added age, kept invasive ductal tumours only, dropped every low-confidence HER2 call, or used the ER−/HER2− vs ER+/HER2− contrast that matches METABRIC. Hallmark enrichment used GSEA prerank on the Wald statistic [17, 18] (1,000 permutations), Fisher over-representation of the DEG lists, and two tests that account for inter-gene correlation: CAMERA [19] and phenotype-permutation GSEA.</w:t>
+        <w:t xml:space="preserve"> We ran PyDESeq2 [15, 16] on raw STAR counts with the design ~ histology + group. It tested |log2FC| &gt; 1 directly (lfc_null = 1), instead of testing for zero change and filtering by fold change afterwards. Shrunk fold changes were used for ranking and plotting. In sensitivity runs we added age, kept only invasive ductal tumours, dropped every low-confidence HER2 call, or used the ER−/HER2− vs ER+/HER2− contrast that matches METABRIC. For Hallmark enrichment we used GSEA prerank on the Wald statistic [17, 18] (1,000 permutations) and Fisher over-representation of the DEG lists. Two further tests take inter-gene correlation into account: CAMERA [19] and phenotype-permutation GSEA.</w:t>
       </w:r>
     </w:p>
     <w:p>
@@ -1164,7 +1164,7 @@
           <w:rFonts w:ascii="Arial" w:hAnsi="Arial"/>
           <w:sz w:val="22"/>
         </w:rPr>
-        <w:t xml:space="preserve"> Targets were clinical ER (n = 1,024, 789 positive) and HER2 (n = 913, 161 positive). L1-penalised logistic regression, a linear SVM, a Random Forest and PLS-DA were trained in nested cross-validation (outer 5 folds × 3 repeats, inner 5 folds, class-balanced weights). A variance filter (top 5,000 genes), scaling, univariate selection of k genes (k ∈ {50, 200, 1000}) and the hyper-parameters were all fitted inside the training folds. The baseline was the receptor gene alone (</w:t>
+        <w:t xml:space="preserve"> Targets were clinical ER (n = 1,024, 789 positive) and HER2 (n = 913, 161 positive). We trained L1-penalised logistic regression, a linear SVM, a Random Forest and PLS-DA in nested cross-validation (outer 5 folds × 3 repeats, inner 5 folds, class-balanced weights). The variance filter (top 5,000 genes), scaling, univariate selection of k genes (k ∈ {50, 200, 1000}) and the hyper-parameters were all fitted inside the training folds. The baseline was the receptor gene on its own (</w:t>
       </w:r>
       <w:r>
         <w:rPr>
@@ -1194,7 +1194,7 @@
           <w:rFonts w:ascii="Arial" w:hAnsi="Arial"/>
           <w:sz w:val="22"/>
         </w:rPr>
-        <w:t xml:space="preserve">), with a cut-off chosen inside the folds. Models were compared on pooled out-of-fold ROC-AUC with the Nadeau–Bengio corrected t-test [20] and a paired bootstrap. An ablation removed </w:t>
+        <w:t xml:space="preserve">), with its cut-off also chosen inside the folds. We compared models on pooled out-of-fold ROC-AUC, using the Nadeau–Bengio corrected t-test [20] and a paired bootstrap. An ablation removed </w:t>
       </w:r>
       <w:r>
         <w:rPr>
@@ -1254,7 +1254,7 @@
           <w:rFonts w:ascii="Arial" w:hAnsi="Arial"/>
           <w:sz w:val="22"/>
         </w:rPr>
-        <w:t xml:space="preserve"> and the 50 PAM50 genes (135 genes). Shuffled labels gave a negative control.</w:t>
+        <w:t xml:space="preserve"> and the 50 PAM50 genes (135 genes in all). Models trained on shuffled labels served as a negative control.</w:t>
       </w:r>
     </w:p>
     <w:p>
@@ -1275,7 +1275,7 @@
           <w:rFonts w:ascii="Arial" w:hAnsi="Arial"/>
           <w:sz w:val="22"/>
         </w:rPr>
-        <w:t xml:space="preserve"> (i) Protein: Mann–Whitney tests on RPPA, and the Spearman correlation between DE fold changes and protein differences for the 85 genes with a total-protein antibody, with a gene-label permutation null; the out-of-fold ER errors were compared with ERα protein. (ii) METABRIC: the ER, HER2 and ER−/HER2− models were refit on all TCGA tumours and frozen (with checksums logged) before any METABRIC label was read, then applied to METABRIC z-scored within cohort on the 18,936 shared genes. DE was replicated by OLS with age (ER-IHC−/HER2-not-gained 286 vs ER-IHC+/HER2-not-gained 1,220). (iii) Survival: Kaplan–Meier, log-rank and Cox models with Schoenfeld checks; TCGA progression-free interval (PFI) with group, age and stage (100 events, so 5 parameters), and METABRIC breast-cancer death within 10 years with group, age, grade and size. (iv) Literature: our numbers were placed next to published ones, each checked against PubMed.</w:t>
+        <w:t xml:space="preserve"> (i) Protein. We ran Mann–Whitney tests on the RPPA data. For the 85 genes with a total-protein antibody, we correlated DE fold changes with protein differences (Spearman) and compared the result with a gene-label permutation null. We also compared the out-of-fold ER errors with ERα protein levels. (ii) METABRIC. The ER, HER2 and ER−/HER2− models were refit on all TCGA tumours and frozen, with checksums logged, before any METABRIC label was read. They were then applied to METABRIC after z-scoring within the cohort on the 18,936 shared genes. DE was replicated by OLS with age as a covariate (ER-IHC−/HER2-not-gained 286 vs ER-IHC+/HER2-not-gained 1,220). (iii) Survival. We used Kaplan–Meier curves, log-rank tests and Cox models with Schoenfeld checks. The TCGA model of progression-free interval (PFI) included group, age and stage (100 events, which allows 5 parameters); the METABRIC model of breast-cancer death within 10 years included group, age, grade and size. (iv) Literature. We placed our numbers next to published ones and checked each source against PubMed.</w:t>
       </w:r>
     </w:p>
     <w:p>
@@ -1304,7 +1304,7 @@
           <w:rFonts w:ascii="Arial" w:hAnsi="Arial"/>
           <w:sz w:val="22"/>
         </w:rPr>
-        <w:t xml:space="preserve">PC1 (14% of variance) was the ER axis: it separated IHC ER-positive from ER-negative tumours with AUC 0.95 and the clinical group explained η² = 0.59 of it, while tissue-source site explained ≤ 0.08 of PC1–4. In the UMAP (Fig. 1a) a separate island of 189 tumours held 129 of 157 TNBC (82%); HER2+ tumours did not form their own island but sat at one edge of the HR+ mass. Marker genes behaved as expected: </w:t>
+        <w:t xml:space="preserve">PC1 (14% of variance) was the ER axis. It separated IHC ER-positive from ER-negative tumours with AUC 0.95, and the clinical group explained η² = 0.59 of its variance. Tissue-source site, by contrast, explained ≤ 0.08 of PC1–4. In the UMAP (Fig. 1a), a separate island of 189 tumours contained 129 of the 157 TNBC (82%). HER2+ tumours did not form an island of their own; they sat at one edge of the HR+ mass. The marker genes behaved as expected. </w:t>
       </w:r>
       <w:r>
         <w:rPr>
@@ -1319,7 +1319,7 @@
           <w:rFonts w:ascii="Arial" w:hAnsi="Arial"/>
           <w:sz w:val="22"/>
         </w:rPr>
-        <w:t xml:space="preserve"> was the strongest single difference between TNBC and HR+/HER2− (rank-biserial r = −0.95), the basal transcription factor </w:t>
+        <w:t xml:space="preserve"> showed the largest single difference between TNBC and HR+/HER2− (rank-biserial r = −0.95), the basal transcription factor </w:t>
       </w:r>
       <w:r>
         <w:rPr>
@@ -1334,7 +1334,7 @@
           <w:rFonts w:ascii="Arial" w:hAnsi="Arial"/>
           <w:sz w:val="22"/>
         </w:rPr>
-        <w:t xml:space="preserve"> was higher in TNBC (r = +0.83) and </w:t>
+        <w:t xml:space="preserve"> was higher in TNBC (r = +0.83), and </w:t>
       </w:r>
       <w:r>
         <w:rPr>
@@ -1377,7 +1377,7 @@
           <w:rFonts w:ascii="Arial" w:hAnsi="Arial"/>
           <w:sz w:val="22"/>
         </w:rPr>
-        <w:t xml:space="preserve">Consensus clustering was most stable at k = 2 (PAC 0.02; k = 5: 0.14). The smaller cluster of 217 tumours held 138 of 157 TNBC (Fig. 1b) and agreed with IHC ER at ARI 0.67 (0.61–0.73) and with the three clinical groups at 0.42, against a ceiling of 0.88 for two clusters (Fig. 1c). k-means, consensus, Ward and average-linkage clusterings agreed at k = 2 (ARI 0.82–1.00). At k = 5 a HER2-enriched cluster appeared, but it was the least reproducible across methods, and the luminal tumours split differently from PAM50 LumA/LumB (ARI 0.35), in line with the luminal continuum described by Netanely et al. [21]. </w:t>
+        <w:t xml:space="preserve">Consensus clustering was most stable at k = 2 (PAC 0.02, compared with 0.14 at k = 5). The smaller of the two clusters had 217 tumours and contained 138 of the 157 TNBC (Fig. 1b). Its agreement with IHC ER was ARI 0.67 (0.61–0.73), and with the three clinical groups 0.42, where the ceiling for two clusters is 0.88 (Fig. 1c). k-means, consensus, Ward and average-linkage clustering gave the same picture at k = 2 (ARI 0.82–1.00). A HER2-enriched cluster appeared at k = 5, but it was the least reproducible across methods. The luminal tumours also split differently from PAM50 LumA/LumB (ARI 0.35), which fits the luminal continuum described by Netanely et al. [21]. </w:t>
       </w:r>
       <w:r>
         <w:rPr>
@@ -1392,7 +1392,7 @@
           <w:rFonts w:ascii="Arial" w:hAnsi="Arial"/>
           <w:sz w:val="22"/>
         </w:rPr>
-        <w:t xml:space="preserve"> expression recovers the ER-negative, basal-like axis strongly and the HER2+ group only weakly.</w:t>
+        <w:t xml:space="preserve"> expression recovers the ER-negative, basal-like axis strongly, but the HER2+ group only weakly.</w:t>
       </w:r>
     </w:p>
     <w:p>
@@ -1475,7 +1475,7 @@
           <w:rFonts w:ascii="Arial" w:hAnsi="Arial"/>
           <w:sz w:val="22"/>
         </w:rPr>
-        <w:t xml:space="preserve">Of 23,439 genes, 2,741 differed more than 2-fold between TNBC and HR+/HER2− at FDR 5% (1,484 higher, 1,257 lower in TNBC; Fig. 2a). A plain Wald test of zero change called 18,604 genes (79%), which shows why the threshold was tested rather than applied afterwards. </w:t>
+        <w:t xml:space="preserve">Of 23,439 genes, 2,741 differed more than 2-fold between TNBC and HR+/HER2− at FDR 5% (1,484 higher, 1,257 lower in TNBC; Fig. 2a). A plain Wald test of zero change would have called 18,604 genes (79%); this is why we tested the threshold instead of applying it afterwards. </w:t>
       </w:r>
       <w:r>
         <w:rPr>
@@ -1505,7 +1505,7 @@
           <w:rFonts w:ascii="Arial" w:hAnsi="Arial"/>
           <w:sz w:val="22"/>
         </w:rPr>
-        <w:t xml:space="preserve"> (−4.4) acted as positive controls. Beyond them, the ER-driven luminal programme was lower in TNBC (</w:t>
+        <w:t xml:space="preserve"> (−4.4) served as positive controls. Beyond these two, the ER-driven luminal programme was lower in TNBC (</w:t>
       </w:r>
       <w:r>
         <w:rPr>
@@ -1595,7 +1595,7 @@
           <w:rFonts w:ascii="Arial" w:hAnsi="Arial"/>
           <w:sz w:val="22"/>
         </w:rPr>
-        <w:t xml:space="preserve"> +2.4). The list was robust: 94% of the DEGs stayed significant with the same sign after adding age, 91% in ductal tumours only (so lobular biology is not being reported as HR+ biology), 87% with strict labels and 96% in the ER−/HER2− contrast. HER2+ vs HR+/HER2− tumours differed in only 148 genes, 33 of them within 2 Mb of </w:t>
+        <w:t xml:space="preserve"> +2.4). The list held up in the sensitivity runs. Of the DEGs, 94% stayed significant with the same sign after adding age, 91% in ductal tumours only (so lobular biology is not being reported as HR+ biology), 87% with strict labels and 96% in the ER−/HER2− contrast. HER2+ and HR+/HER2− tumours differed in only 148 genes, and 33 of these lie within 2 Mb of </w:t>
       </w:r>
       <w:r>
         <w:rPr>
@@ -1623,7 +1623,7 @@
           <w:rFonts w:ascii="Arial" w:hAnsi="Arial"/>
           <w:sz w:val="22"/>
         </w:rPr>
-        <w:t xml:space="preserve">GSEA found 28 Hallmark sets at FDR &lt; 0.05 (Fig. 2b): proliferation (E2F targets, NES +3.11; G2M checkpoint +2.88), MYC targets (+2.74), interferon-γ (+2.18) and mTORC1 (+2.16) were higher in TNBC, and the early and late oestrogen responses lower (−3.08, −2.40), as in the TCGA and CPTAC proteogenomic studies [4, 23]. Gene-permutation q-values are optimistic when genes in a set are co-expressed (median inter-gene correlation 0.06, up to 0.25 for E2F targets). Both correlation-aware tests agreed with the prerank direction for all 28 sets (NES ρ = 0.92), but only the early oestrogen response stayed significant (CAMERA q &lt; 0.05). We therefore report the proliferation, MYC and immune programmes as consistent shifts with large effect sizes, not as proven to be more shifted than the average gene. </w:t>
+        <w:t xml:space="preserve">GSEA found 28 Hallmark sets at FDR &lt; 0.05 (Fig. 2b). Proliferation (E2F targets, NES +3.11; G2M checkpoint +2.88), MYC targets (+2.74), interferon-γ (+2.18) and mTORC1 (+2.16) were higher in TNBC. The early and late oestrogen responses were lower (−3.08, −2.40), as in the TCGA and CPTAC proteogenomic studies [4, 23]. Gene-permutation q-values are too optimistic when the genes in a set are co-expressed, and here the median inter-gene correlation was 0.06 (up to 0.25 for E2F targets). Both correlation-aware tests gave the same direction as prerank for all 28 sets (NES ρ = 0.92), but only the early oestrogen response remained significant (CAMERA q &lt; 0.05). We therefore describe the proliferation, MYC and immune programmes as consistent shifts with large effect sizes. We do not claim that they are shifted more than the average gene. </w:t>
       </w:r>
       <w:r>
         <w:rPr>
@@ -1638,7 +1638,7 @@
           <w:rFonts w:ascii="Arial" w:hAnsi="Arial"/>
           <w:sz w:val="22"/>
         </w:rPr>
-        <w:t xml:space="preserve"> TNBC switches off the oestrogen-response programme and switches on basal and proliferative genes; HER2+ tumours differ far less, mainly at the amplicon.</w:t>
+        <w:t xml:space="preserve"> in TNBC the oestrogen-response programme is turned down and basal and proliferative genes are turned up. HER2+ tumours differ much less, mainly at the amplicon.</w:t>
       </w:r>
     </w:p>
     <w:p>
@@ -1736,7 +1736,7 @@
           <w:rFonts w:ascii="Arial" w:hAnsi="Arial"/>
           <w:sz w:val="22"/>
         </w:rPr>
-        <w:t xml:space="preserve"> alone reached AUC 0.959 and the best model (Random Forest) 0.954 (corrected t-test p = 0.69); for HER2, </w:t>
+        <w:t xml:space="preserve"> alone reached AUC 0.959 and the best model (Random Forest) 0.954 (corrected t-test p = 0.69). For HER2, </w:t>
       </w:r>
       <w:r>
         <w:rPr>
@@ -1751,7 +1751,7 @@
           <w:rFonts w:ascii="Arial" w:hAnsi="Arial"/>
           <w:sz w:val="22"/>
         </w:rPr>
-        <w:t xml:space="preserve"> alone 0.845 and the best model 0.851 (p = 0.66) (Fig. 3a–b). All four model types gave similar AUCs (Fig. 3c), shuffled labels gave MCC −0.01 (ER) and +0.04 (HER2), and accuracy of the single gene (94% for </w:t>
+        <w:t xml:space="preserve"> alone reached 0.845 and the best model 0.851 (p = 0.66) (Fig. 3a–b). The four model types gave similar AUCs (Fig. 3c), and shuffled labels gave MCC −0.01 (ER) and +0.04 (HER2). The single-gene accuracy (94% for </w:t>
       </w:r>
       <w:r>
         <w:rPr>
@@ -1781,7 +1781,7 @@
           <w:rFonts w:ascii="Arial" w:hAnsi="Arial"/>
           <w:sz w:val="22"/>
         </w:rPr>
-        <w:t xml:space="preserve">) matched the 88–96% reported for arrays by Gong et al. [24]. The ablation separates the two receptors. Without the receptor genes, the amplicon and the PAM50 genes, ER was predicted as well as before (AUC 0.948–0.953): ER status is written across a whole regulon, not one gene. HER2 fell to 0.784–0.820, the same at 2 Mb, so most HER2 signal sits in the amplicon and the remainder largely reflects the lower-ER, proliferative character of HER2+ tumours. Label quality limits HER2: dropping the 30 HER2+ calls based on status text alone raised </w:t>
+        <w:t xml:space="preserve">) matched the 88–96% that Gong et al. reported for arrays [24]. The ablation treated the two receptors very differently. With the receptor genes, the amplicon and the PAM50 genes removed, ER was predicted as well as before (AUC 0.948–0.953), so the ER signal is spread across a whole regulon rather than carried by one gene. HER2 dropped to 0.784–0.820, and the 2 Mb ablation gave the same result. Most of the HER2 signal therefore sits in the amplicon, and what remains largely reflects the lower ER expression and higher proliferation of HER2+ tumours. Label quality also limits HER2. When we dropped the 30 HER2+ calls that rest on status text alone, </w:t>
       </w:r>
       <w:r>
         <w:rPr>
@@ -1796,7 +1796,7 @@
           <w:rFonts w:ascii="Arial" w:hAnsi="Arial"/>
           <w:sz w:val="22"/>
         </w:rPr>
-        <w:t xml:space="preserve"> alone to 0.894 and the best model to 0.884. Only for the combined ER−/HER2− target did a model beat one gene (0.964 vs 0.948 for </w:t>
+        <w:t xml:space="preserve"> alone rose to 0.894 and the best model to 0.884. The combined ER−/HER2− target was the only one where a model beat a single gene (0.964 vs 0.948 for </w:t>
       </w:r>
       <w:r>
         <w:rPr>
@@ -1811,7 +1811,7 @@
           <w:rFonts w:ascii="Arial" w:hAnsi="Arial"/>
           <w:sz w:val="22"/>
         </w:rPr>
-        <w:t xml:space="preserve">; p = 0.005), because no single gene encodes both receptors. As a secondary, circular benchmark, the same pipeline reproduced 5-class PAM50 calls with 88% accuracy (87% without the PAM50 genes). </w:t>
+        <w:t xml:space="preserve">; p = 0.005), since no single gene encodes both receptors. As a secondary (and circular) benchmark, the same pipeline reproduced the 5-class PAM50 calls with 88% accuracy (87% without the PAM50 genes). </w:t>
       </w:r>
       <w:r>
         <w:rPr>
@@ -1826,7 +1826,7 @@
           <w:rFonts w:ascii="Arial" w:hAnsi="Arial"/>
           <w:sz w:val="22"/>
         </w:rPr>
-        <w:t xml:space="preserve"> no; the receptor gene already carries almost all the information about clinical status.</w:t>
+        <w:t xml:space="preserve"> no. The receptor gene on its own already carries almost all the information about clinical status.</w:t>
       </w:r>
     </w:p>
     <w:p>
@@ -1917,7 +1917,7 @@
           <w:rFonts w:ascii="Arial" w:hAnsi="Arial"/>
           <w:sz w:val="22"/>
         </w:rPr>
-        <w:t xml:space="preserve"> 92 of 131 RPPA antibodies differed between TNBC and HR+/HER2− (q &lt; 0.05). Across the 85 genes with a total-protein antibody, the mRNA fold change predicted the protein difference with ρ = 0.80 (permutation p = 0.001; 95th percentile of the null 0.49; Fig. 4a), and all 15 DEGs with an antibody agreed in sign. The ER errors are informative (Fig. 4b): of the 15 IHC ER-negative tumours called ER-positive, 8 of 10 with RPPA had ERα protein above the 95th percentile of correctly called ER-negative tumours, which suggests IHC false negatives rather than model errors. Of the 68 IHC ER-positive tumours called negative, 40 were PAM50 Basal or HER2-enriched and 26 of 43 with RPPA had ERα below the 5th percentile of correctly called ER-positive tumours, consistent with ER-low tumours or IHC false positives.</w:t>
+        <w:t xml:space="preserve"> Of the 131 RPPA antibodies, 92 differed between TNBC and HR+/HER2− (q &lt; 0.05). For the 85 genes with a total-protein antibody, the mRNA fold change predicted the protein difference with ρ = 0.80 (permutation p = 0.001; 95th percentile of the null 0.49; Fig. 4a), and all 15 DEGs with an antibody agreed in sign. The ER errors are informative (Fig. 4b). 15 IHC ER-negative tumours were called ER-positive, and 8 of 10 of them with RPPA had ERα protein above the 95th percentile of correctly called ER-negative tumours. This points to IHC false negatives rather than model errors. Of the 68 IHC ER-positive tumours called negative, 40 were PAM50 Basal or HER2-enriched, and 26 of 43 with RPPA had ERα below the 5th percentile of correctly called ER-positive tumours. These fit ER-low tumours or IHC false positives.</w:t>
       </w:r>
     </w:p>
     <w:p>
@@ -1938,7 +1938,7 @@
           <w:rFonts w:ascii="Arial" w:hAnsi="Arial"/>
           <w:sz w:val="22"/>
         </w:rPr>
-        <w:t xml:space="preserve"> The frozen TCGA models transferred without loss (Fig. 4c): ER AUC 0.959 (0.947–0.970) against 0.950 in TCGA cross-validation, HER2 (copy-number gain) 0.906 against 0.838, and ER−/HER2− vs rest 0.935. HER2 transferred better than it cross-validated because METABRIC's copy-number label tracks mRNA more closely than clinical IHC/FISH. As in TCGA, the models did not beat the gene alone (</w:t>
+        <w:t xml:space="preserve"> The frozen TCGA models lost no performance in METABRIC (Fig. 4c). ER reached AUC 0.959 (0.947–0.970) against 0.950 in TCGA cross-validation, HER2 (copy-number gain) 0.906 against 0.838, and ER−/HER2− vs rest 0.935. HER2 did better in METABRIC than in cross-validation, most likely because a copy-number label follows mRNA more closely than clinical IHC/FISH does. As in TCGA, the models did not beat the single gene (</w:t>
       </w:r>
       <w:r>
         <w:rPr>
@@ -1968,7 +1968,7 @@
           <w:rFonts w:ascii="Arial" w:hAnsi="Arial"/>
           <w:sz w:val="22"/>
         </w:rPr>
-        <w:t xml:space="preserve"> 0.900). Of the 1,857 TCGA DEGs measured on the array, 1,599 (86%) replicated with the same sign at q &lt; 0.05 (effect-size ρ = 0.79), and Hallmark NES agreed with ρ = 0.94.</w:t>
+        <w:t xml:space="preserve"> 0.900). Of the 1,857 TCGA DEGs measured on the array, 1,599 (86%) replicated with the same sign at q &lt; 0.05 (effect-size ρ = 0.79), and the Hallmark NES values agreed with ρ = 0.94.</w:t>
       </w:r>
     </w:p>
     <w:p>
@@ -2578,7 +2578,7 @@
           <w:rFonts w:ascii="Arial" w:hAnsi="Arial"/>
           <w:sz w:val="22"/>
         </w:rPr>
-        <w:t xml:space="preserve"> Table 2 shows that the clinical–PAM50 concordance, the single-gene accuracy and the subtype order of risk agree with the literature. Clinical HER2+ tumours were called HER2-enriched less often than in TCGA 2012; with the 2012 HER2 labels and PAM50 calls the same tumours give 52%, so the gap comes from the larger cohort, the newer PAM50 calls and the HER2 rule, not from an error. Unlike the 13–22% loss reported for a multimodal model moved from TCGA to CPTAC [26], our simpler mRNA models lost nothing in METABRIC.</w:t>
+        <w:t xml:space="preserve"> The clinical–PAM50 concordance, the single-gene accuracy and the order of risk across subtypes all agree with the literature (Table 2). Clinical HER2+ tumours were called HER2-enriched less often than in TCGA 2012. With the 2012 HER2 labels and PAM50 calls, the same tumours give 52%, so the gap comes from the larger cohort, the newer PAM50 calls and the HER2 rule rather than from an error. Shah and Patel reported a 13–22% loss when a multimodal model was moved from TCGA to CPTAC [26]; our simpler mRNA models lost nothing in METABRIC.</w:t>
       </w:r>
     </w:p>
     <w:p>
@@ -2661,7 +2661,7 @@
           <w:rFonts w:ascii="Arial" w:hAnsi="Arial"/>
           <w:sz w:val="22"/>
         </w:rPr>
-        <w:t>In TCGA (median follow-up 2.4 years) PFI differed by group (log-rank p = 0.0072; Fig. 5a). Adjusted for age and stage, TNBC had a hazard ratio (HR) of 2.69 (95% CI 1.70–4.26) against HR+/HER2−, while HER2+ did not differ (HR 0.98, 95% CI 0.56–1.71; Fig. 5c); the group effect met the proportional-hazards assumption (p = 0.49), age did not (p = 0.03). In METABRIC (1,846 tumours, 492 breast-cancer deaths within 10 years; Fig. 5b) HER2 gain carried HR 1.90 (95% CI 1.54–2.35). The ER−/HER2− effect violated proportional hazards; split at 5 years it was 2.46 in years 0–5 and 0.51 in years 5–10 (interaction p = 6 × 10</w:t>
+        <w:t>In TCGA (median follow-up 2.4 years), PFI differed between the groups (log-rank p = 0.0072; Fig. 5a). After adjusting for age and stage, TNBC had a hazard ratio (HR) of 2.69 (95% CI 1.70–4.26) against HR+/HER2−, whereas HER2+ did not differ (HR 0.98, 95% CI 0.56–1.71; Fig. 5c). The group effect met the proportional-hazards assumption (p = 0.49), but age did not (p = 0.03). In METABRIC (1,846 tumours, 492 breast-cancer deaths within 10 years; Fig. 5b), HER2 gain carried an HR of 1.90 (95% CI 1.54–2.35). The ER−/HER2− effect violated proportional hazards. Split at 5 years, it was 2.46 in years 0–5 and 0.51 in years 5–10 (interaction p = 6 × 10</w:t>
       </w:r>
       <w:r>
         <w:rPr>
@@ -2676,7 +2676,7 @@
           <w:rFonts w:ascii="Arial" w:hAnsi="Arial"/>
           <w:sz w:val="22"/>
         </w:rPr>
-        <w:t>), the known early-relapse pattern of ER-negative disease. The frozen TCGA classifier's predicted ER−/HER2− group also separated METABRIC survival (log-rank p = 3 × 10</w:t>
+        <w:t>), which is the known early-relapse pattern of ER-negative disease. The ER−/HER2− group predicted by the frozen TCGA classifier also separated survival in METABRIC (log-rank p = 3 × 10</w:t>
       </w:r>
       <w:r>
         <w:rPr>
@@ -2691,7 +2691,7 @@
           <w:rFonts w:ascii="Arial" w:hAnsi="Arial"/>
           <w:sz w:val="22"/>
         </w:rPr>
-        <w:t>), and METABRIC's PAM50 subtypes reproduced the risk order reported by Nielsen et al. [25] (Table 2).</w:t>
+        <w:t>), and the METABRIC PAM50 subtypes followed the risk order reported by Nielsen et al. [25] (Table 2).</w:t>
       </w:r>
     </w:p>
     <w:p>
@@ -2782,7 +2782,7 @@
           <w:rFonts w:ascii="Arial" w:hAnsi="Arial"/>
           <w:sz w:val="22"/>
         </w:rPr>
-        <w:t xml:space="preserve"> (1) The dominant structure in breast tumour expression is the ER axis; label-free methods recover TNBC as a basal-like group but not HER2+ tumours as a group. (2) TNBC is a distinct transcriptional state, with 2,741 genes more than 2-fold different from HR+/HER2− tumours, robust to covariates, histology and label noise. (3) Whole-transcriptome classifiers match but do not beat </w:t>
+        <w:t xml:space="preserve"> (1) The main structure in breast tumour expression is the ER axis. Methods that do not use labels recover TNBC as a basal-like group, but they do not recover HER2+ tumours as a group. (2) TNBC is a distinct transcriptional state: 2,741 genes differ more than 2-fold from HR+/HER2− tumours, and this list is stable to covariates, histology and label noise. (3) Whole-transcriptome classifiers perform as well as </w:t>
       </w:r>
       <w:r>
         <w:rPr>
@@ -2812,7 +2812,7 @@
           <w:rFonts w:ascii="Arial" w:hAnsi="Arial"/>
           <w:sz w:val="22"/>
         </w:rPr>
-        <w:t xml:space="preserve"> alone. (4) The results hold in protein, in an independent cohort with labels from other assays, and against published numbers.</w:t>
+        <w:t xml:space="preserve"> alone, but not better. (4) The results agree with protein data, with an independent cohort whose labels come from other assays, and with published numbers.</w:t>
       </w:r>
     </w:p>
     <w:p>
@@ -2833,7 +2833,7 @@
           <w:rFonts w:ascii="Arial" w:hAnsi="Arial"/>
           <w:sz w:val="22"/>
         </w:rPr>
-        <w:t xml:space="preserve"> ER status is a regulon-wide state: removing </w:t>
+        <w:t xml:space="preserve"> ER status behaves as a state of the whole regulon. Removing </w:t>
       </w:r>
       <w:r>
         <w:rPr>
@@ -2908,7 +2908,7 @@
           <w:rFonts w:ascii="Arial" w:hAnsi="Arial"/>
           <w:sz w:val="22"/>
         </w:rPr>
-        <w:t xml:space="preserve"> move together with it. TNBC tumours replace this programme with basal transcription factors (</w:t>
+        <w:t xml:space="preserve"> move together with it. In TNBC this programme is replaced by basal transcription factors (</w:t>
       </w:r>
       <w:r>
         <w:rPr>
@@ -2953,7 +2953,7 @@
           <w:rFonts w:ascii="Arial" w:hAnsi="Arial"/>
           <w:sz w:val="22"/>
         </w:rPr>
-        <w:t>) and high proliferation and MYC activity, and they relapse early, as the time-dependent METABRIC hazard shows. HER2 positivity, in contrast, is mostly a local genomic event: the amplicon dominates both the DE list and the classifier, and the rest of the transcriptome resembles HR+ disease. Practically, an expression assay adds little to IHC for ER and HER2 calls, but tumours where mRNA and IHC disagree are worth a second look: our ER error analysis suggests that some IHC calls, not the model, are wrong.</w:t>
+        <w:t>) and high proliferation and MYC activity, and these tumours relapse early, as the time-dependent hazard in METABRIC shows. HER2 positivity, on the other hand, is mostly a local genomic event. The amplicon dominates both the DE list and the classifier, and the rest of the transcriptome resembles HR+ disease. In practice, an expression assay adds little to IHC for ER and HER2 calls. Tumours in which mRNA and IHC disagree are still worth a second look, since our ER error analysis suggests that some of the IHC calls, not the model, are wrong.</w:t>
       </w:r>
     </w:p>
     <w:p>
@@ -2974,7 +2974,7 @@
           <w:rFonts w:ascii="Arial" w:hAnsi="Arial"/>
           <w:sz w:val="22"/>
         </w:rPr>
-        <w:t xml:space="preserve"> (i) TNBC and HR+ tumours differ in tumour purity and immune infiltration, which contribute to the proliferation and immune signals; DE was not adjusted for purity. (ii) Pathway significance shrinks once inter-gene correlation is counted, so pathway findings are effect sizes, not tests. (iii) HER2 labels are noisy (some rest on status text alone) and the TCGA HER2 rule is our own. (iv) METABRIC lacks PR and uses copy-number HER2, so its groups are not identical to the clinical ones. (v) TCGA survival is short (median 2.4 years) and treatment was not modelled. (vi) Classifier comparisons rest on overlapping folds, which the corrected test handles conservatively.</w:t>
+        <w:t xml:space="preserve"> (i) TNBC and HR+ tumours differ in tumour purity and immune infiltration, which contribute to the proliferation and immune signals, and DE was not adjusted for purity. (ii) Pathway significance shrinks once inter-gene correlation is taken into account, so the pathway findings should be read as effect sizes rather than tests. (iii) The HER2 labels are noisy (some rest on status text alone), and the TCGA HER2 rule is our own. (iv) METABRIC has no PR data and uses copy-number HER2, so its groups are not identical to the clinical ones. (v) TCGA follow-up is short (median 2.4 years), and treatment was not modelled. (vi) The classifier comparisons rest on overlapping folds; the corrected test handles this conservatively.</w:t>
       </w:r>
     </w:p>
     <w:p>
@@ -2995,7 +2995,7 @@
           <w:rFonts w:ascii="Arial" w:hAnsi="Arial"/>
           <w:sz w:val="22"/>
         </w:rPr>
-        <w:t xml:space="preserve"> Adjust DE for purity (e.g. ESTIMATE scores) or deconvolve the immune signal; test whether </w:t>
+        <w:t xml:space="preserve"> DE could be adjusted for purity (e.g. with ESTIMATE scores), or the immune signal could be deconvolved. It would be useful to test whether </w:t>
       </w:r>
       <w:r>
         <w:rPr>
@@ -3010,7 +3010,7 @@
           <w:rFonts w:ascii="Arial" w:hAnsi="Arial"/>
           <w:sz w:val="22"/>
         </w:rPr>
-        <w:t xml:space="preserve"> mRNA can resolve IHC 2+ equivocal cases; extend the protein check to the CPTAC mass-spectrometry proteome; split the HR+/HER2− group into proliferative and immune subgroups and test their outcome in METABRIC.</w:t>
+        <w:t xml:space="preserve"> mRNA can resolve equivocal IHC 2+ cases, and to extend the protein check to the CPTAC mass-spectrometry proteome. Finally, the HR+/HER2− group could be split into proliferative and immune subgroups and their outcome tested in METABRIC.</w:t>
       </w:r>
     </w:p>
     <w:p>

</xml_diff>